<commit_message>
finished sections 1 and 2
</commit_message>
<xml_diff>
--- a/HW2/vp2025_212047542_327703013/ex2_212047542_327703013.docx
+++ b/HW2/vp2025_212047542_327703013/ex2_212047542_327703013.docx
@@ -472,6 +472,1166 @@
         </w:rPr>
         <w:t>object.</w:t>
       </w:r>
+    </w:p>
+    <w:p>
+      <w:pPr>
+        <w:ind w:left="360"/>
+        <w:rPr>
+          <w:b/>
+          <w:bCs/>
+          <w:sz w:val="28"/>
+          <w:szCs w:val="28"/>
+        </w:rPr>
+      </w:pPr>
+      <w:r>
+        <w:rPr>
+          <w:b/>
+          <w:bCs/>
+          <w:sz w:val="28"/>
+          <w:szCs w:val="28"/>
+        </w:rPr>
+        <w:t>Section 2</w:t>
+      </w:r>
+    </w:p>
+    <w:p>
+      <w:pPr>
+        <w:ind w:left="360"/>
+        <w:rPr>
+          <w:sz w:val="24"/>
+          <w:szCs w:val="24"/>
+        </w:rPr>
+      </w:pPr>
+      <w:r>
+        <w:rPr>
+          <w:sz w:val="24"/>
+          <w:szCs w:val="24"/>
+        </w:rPr>
+        <w:t>4.1. We receive the following results for LK after one step:</w:t>
+      </w:r>
+    </w:p>
+    <w:p>
+      <w:pPr>
+        <w:ind w:left="360"/>
+        <w:rPr>
+          <w:sz w:val="24"/>
+          <w:szCs w:val="24"/>
+          <w:lang w:val="en-US"/>
+        </w:rPr>
+      </w:pPr>
+    </w:p>
+    <w:p>
+      <w:pPr>
+        <w:ind w:left="360"/>
+        <w:rPr>
+          <w:sz w:val="24"/>
+          <w:szCs w:val="24"/>
+        </w:rPr>
+      </w:pPr>
+    </w:p>
+    <w:p>
+      <w:pPr>
+        <w:ind w:left="360"/>
+        <w:rPr>
+          <w:sz w:val="24"/>
+          <w:szCs w:val="24"/>
+        </w:rPr>
+      </w:pPr>
+    </w:p>
+    <w:p>
+      <w:pPr>
+        <w:ind w:left="360"/>
+        <w:rPr>
+          <w:sz w:val="24"/>
+          <w:szCs w:val="24"/>
+        </w:rPr>
+      </w:pPr>
+    </w:p>
+    <w:p>
+      <w:pPr>
+        <w:ind w:left="360"/>
+        <w:rPr>
+          <w:sz w:val="24"/>
+          <w:szCs w:val="24"/>
+        </w:rPr>
+      </w:pPr>
+    </w:p>
+    <w:p>
+      <w:pPr>
+        <w:ind w:left="360"/>
+        <w:rPr>
+          <w:sz w:val="24"/>
+          <w:szCs w:val="24"/>
+        </w:rPr>
+      </w:pPr>
+    </w:p>
+    <w:p>
+      <w:pPr>
+        <w:ind w:left="360"/>
+        <w:rPr>
+          <w:sz w:val="24"/>
+          <w:szCs w:val="24"/>
+        </w:rPr>
+      </w:pPr>
+    </w:p>
+    <w:p>
+      <w:pPr>
+        <w:ind w:left="360"/>
+        <w:rPr>
+          <w:sz w:val="24"/>
+          <w:szCs w:val="24"/>
+        </w:rPr>
+      </w:pPr>
+    </w:p>
+    <w:p>
+      <w:pPr>
+        <w:ind w:left="360"/>
+        <w:rPr>
+          <w:sz w:val="24"/>
+          <w:szCs w:val="24"/>
+        </w:rPr>
+      </w:pPr>
+    </w:p>
+    <w:p>
+      <w:pPr>
+        <w:ind w:left="360"/>
+        <w:rPr>
+          <w:sz w:val="24"/>
+          <w:szCs w:val="24"/>
+        </w:rPr>
+      </w:pPr>
+    </w:p>
+    <w:p>
+      <w:pPr>
+        <w:ind w:left="360"/>
+        <w:rPr>
+          <w:sz w:val="24"/>
+          <w:szCs w:val="24"/>
+        </w:rPr>
+      </w:pPr>
+    </w:p>
+    <w:p>
+      <w:pPr>
+        <w:ind w:left="360"/>
+        <w:rPr>
+          <w:sz w:val="24"/>
+          <w:szCs w:val="24"/>
+        </w:rPr>
+      </w:pPr>
+    </w:p>
+    <w:p>
+      <w:pPr>
+        <w:ind w:left="360"/>
+        <w:rPr>
+          <w:sz w:val="24"/>
+          <w:szCs w:val="24"/>
+        </w:rPr>
+      </w:pPr>
+    </w:p>
+    <w:p>
+      <w:pPr>
+        <w:ind w:left="360"/>
+        <w:rPr>
+          <w:sz w:val="24"/>
+          <w:szCs w:val="24"/>
+        </w:rPr>
+      </w:pPr>
+      <w:r>
+        <w:rPr>
+          <w:sz w:val="24"/>
+          <w:szCs w:val="24"/>
+          <w:lang w:val="en-US"/>
+        </w:rPr>
+        <w:lastRenderedPageBreak/>
+        <w:drawing>
+          <wp:anchor distT="0" distB="0" distL="114300" distR="114300" simplePos="0" relativeHeight="251658240" behindDoc="1" locked="0" layoutInCell="1" allowOverlap="1" wp14:anchorId="1A6E8729" wp14:editId="65910D42">
+            <wp:simplePos x="0" y="0"/>
+            <wp:positionH relativeFrom="margin">
+              <wp:posOffset>-213360</wp:posOffset>
+            </wp:positionH>
+            <wp:positionV relativeFrom="paragraph">
+              <wp:posOffset>0</wp:posOffset>
+            </wp:positionV>
+            <wp:extent cx="6324600" cy="5494020"/>
+            <wp:effectExtent l="0" t="0" r="0" b="0"/>
+            <wp:wrapNone/>
+            <wp:docPr id="614167782" name="תמונה 2"/>
+            <wp:cNvGraphicFramePr>
+              <a:graphicFrameLocks xmlns:a="http://schemas.openxmlformats.org/drawingml/2006/main" noChangeAspect="1"/>
+            </wp:cNvGraphicFramePr>
+            <a:graphic xmlns:a="http://schemas.openxmlformats.org/drawingml/2006/main">
+              <a:graphicData uri="http://schemas.openxmlformats.org/drawingml/2006/picture">
+                <pic:pic xmlns:pic="http://schemas.openxmlformats.org/drawingml/2006/picture">
+                  <pic:nvPicPr>
+                    <pic:cNvPr id="0" name="Picture 6"/>
+                    <pic:cNvPicPr>
+                      <a:picLocks noChangeAspect="1" noChangeArrowheads="1"/>
+                    </pic:cNvPicPr>
+                  </pic:nvPicPr>
+                  <pic:blipFill rotWithShape="1">
+                    <a:blip r:embed="rId6">
+                      <a:extLst>
+                        <a:ext uri="{28A0092B-C50C-407E-A947-70E740481C1C}">
+                          <a14:useLocalDpi xmlns:a14="http://schemas.microsoft.com/office/drawing/2010/main" val="0"/>
+                        </a:ext>
+                      </a:extLst>
+                    </a:blip>
+                    <a:srcRect b="13133"/>
+                    <a:stretch>
+                      <a:fillRect/>
+                    </a:stretch>
+                  </pic:blipFill>
+                  <pic:spPr bwMode="auto">
+                    <a:xfrm>
+                      <a:off x="0" y="0"/>
+                      <a:ext cx="6324600" cy="5494020"/>
+                    </a:xfrm>
+                    <a:prstGeom prst="rect">
+                      <a:avLst/>
+                    </a:prstGeom>
+                    <a:noFill/>
+                    <a:ln>
+                      <a:noFill/>
+                    </a:ln>
+                    <a:extLst>
+                      <a:ext uri="{53640926-AAD7-44D8-BBD7-CCE9431645EC}">
+                        <a14:shadowObscured xmlns:a14="http://schemas.microsoft.com/office/drawing/2010/main"/>
+                      </a:ext>
+                    </a:extLst>
+                  </pic:spPr>
+                </pic:pic>
+              </a:graphicData>
+            </a:graphic>
+            <wp14:sizeRelH relativeFrom="margin">
+              <wp14:pctWidth>0</wp14:pctWidth>
+            </wp14:sizeRelH>
+            <wp14:sizeRelV relativeFrom="margin">
+              <wp14:pctHeight>0</wp14:pctHeight>
+            </wp14:sizeRelV>
+          </wp:anchor>
+        </w:drawing>
+      </w:r>
+    </w:p>
+    <w:p>
+      <w:pPr>
+        <w:ind w:left="360"/>
+        <w:rPr>
+          <w:sz w:val="24"/>
+          <w:szCs w:val="24"/>
+        </w:rPr>
+      </w:pPr>
+    </w:p>
+    <w:p>
+      <w:pPr>
+        <w:ind w:left="360"/>
+        <w:rPr>
+          <w:sz w:val="24"/>
+          <w:szCs w:val="24"/>
+        </w:rPr>
+      </w:pPr>
+    </w:p>
+    <w:p>
+      <w:pPr>
+        <w:ind w:left="360"/>
+        <w:rPr>
+          <w:sz w:val="24"/>
+          <w:szCs w:val="24"/>
+        </w:rPr>
+      </w:pPr>
+    </w:p>
+    <w:p>
+      <w:pPr>
+        <w:ind w:left="360"/>
+        <w:rPr>
+          <w:sz w:val="24"/>
+          <w:szCs w:val="24"/>
+        </w:rPr>
+      </w:pPr>
+    </w:p>
+    <w:p>
+      <w:pPr>
+        <w:ind w:left="360"/>
+        <w:rPr>
+          <w:sz w:val="24"/>
+          <w:szCs w:val="24"/>
+        </w:rPr>
+      </w:pPr>
+    </w:p>
+    <w:p>
+      <w:pPr>
+        <w:ind w:left="360"/>
+        <w:rPr>
+          <w:sz w:val="24"/>
+          <w:szCs w:val="24"/>
+        </w:rPr>
+      </w:pPr>
+    </w:p>
+    <w:p>
+      <w:pPr>
+        <w:ind w:left="360"/>
+        <w:rPr>
+          <w:sz w:val="24"/>
+          <w:szCs w:val="24"/>
+        </w:rPr>
+      </w:pPr>
+    </w:p>
+    <w:p>
+      <w:pPr>
+        <w:ind w:left="360"/>
+        <w:rPr>
+          <w:sz w:val="24"/>
+          <w:szCs w:val="24"/>
+        </w:rPr>
+      </w:pPr>
+    </w:p>
+    <w:p>
+      <w:pPr>
+        <w:ind w:left="360"/>
+        <w:rPr>
+          <w:sz w:val="24"/>
+          <w:szCs w:val="24"/>
+        </w:rPr>
+      </w:pPr>
+    </w:p>
+    <w:p>
+      <w:pPr>
+        <w:ind w:left="360"/>
+        <w:rPr>
+          <w:sz w:val="24"/>
+          <w:szCs w:val="24"/>
+        </w:rPr>
+      </w:pPr>
+    </w:p>
+    <w:p>
+      <w:pPr>
+        <w:ind w:left="360"/>
+        <w:rPr>
+          <w:sz w:val="24"/>
+          <w:szCs w:val="24"/>
+        </w:rPr>
+      </w:pPr>
+    </w:p>
+    <w:p>
+      <w:pPr>
+        <w:ind w:left="360"/>
+        <w:rPr>
+          <w:sz w:val="24"/>
+          <w:szCs w:val="24"/>
+        </w:rPr>
+      </w:pPr>
+    </w:p>
+    <w:p>
+      <w:pPr>
+        <w:ind w:left="360"/>
+        <w:rPr>
+          <w:sz w:val="24"/>
+          <w:szCs w:val="24"/>
+        </w:rPr>
+      </w:pPr>
+    </w:p>
+    <w:p>
+      <w:pPr>
+        <w:ind w:left="360"/>
+        <w:rPr>
+          <w:sz w:val="24"/>
+          <w:szCs w:val="24"/>
+        </w:rPr>
+      </w:pPr>
+    </w:p>
+    <w:p>
+      <w:pPr>
+        <w:ind w:left="360"/>
+        <w:rPr>
+          <w:sz w:val="24"/>
+          <w:szCs w:val="24"/>
+        </w:rPr>
+      </w:pPr>
+    </w:p>
+    <w:p>
+      <w:pPr>
+        <w:ind w:left="360"/>
+        <w:rPr>
+          <w:sz w:val="24"/>
+          <w:szCs w:val="24"/>
+        </w:rPr>
+      </w:pPr>
+    </w:p>
+    <w:p>
+      <w:pPr>
+        <w:ind w:left="360"/>
+        <w:rPr>
+          <w:sz w:val="24"/>
+          <w:szCs w:val="24"/>
+        </w:rPr>
+      </w:pPr>
+    </w:p>
+    <w:p>
+      <w:pPr>
+        <w:ind w:left="360"/>
+        <w:rPr>
+          <w:sz w:val="24"/>
+          <w:szCs w:val="24"/>
+        </w:rPr>
+      </w:pPr>
+    </w:p>
+    <w:p>
+      <w:pPr>
+        <w:ind w:left="360"/>
+        <w:rPr>
+          <w:sz w:val="24"/>
+          <w:szCs w:val="24"/>
+        </w:rPr>
+      </w:pPr>
+    </w:p>
+    <w:p>
+      <w:pPr>
+        <w:ind w:left="360"/>
+        <w:rPr>
+          <w:sz w:val="24"/>
+          <w:szCs w:val="24"/>
+          <w:lang w:val="en-US"/>
+        </w:rPr>
+      </w:pPr>
+      <w:r>
+        <w:rPr>
+          <w:sz w:val="24"/>
+          <w:szCs w:val="24"/>
+        </w:rPr>
+        <w:t>As we can see, t</w:t>
+      </w:r>
+      <w:r>
+        <w:rPr>
+          <w:sz w:val="24"/>
+          <w:szCs w:val="24"/>
+        </w:rPr>
+        <w:t>he displacement maps reveal that motion estimation is only picking up noisy, localized adjustments</w:t>
+      </w:r>
+      <w:r>
+        <w:rPr>
+          <w:sz w:val="24"/>
+          <w:szCs w:val="24"/>
+        </w:rPr>
+        <w:t>, focusing mainly</w:t>
+      </w:r>
+      <w:r>
+        <w:rPr>
+          <w:sz w:val="24"/>
+          <w:szCs w:val="24"/>
+        </w:rPr>
+        <w:t xml:space="preserve"> </w:t>
+      </w:r>
+      <w:r>
+        <w:rPr>
+          <w:sz w:val="24"/>
+          <w:szCs w:val="24"/>
+        </w:rPr>
+        <w:t xml:space="preserve">on </w:t>
+      </w:r>
+      <w:r>
+        <w:rPr>
+          <w:sz w:val="24"/>
+          <w:szCs w:val="24"/>
+        </w:rPr>
+        <w:t>highly textured structural boundaries like the upper mountain ridges and the waterfall base</w:t>
+      </w:r>
+      <w:r>
+        <w:rPr>
+          <w:sz w:val="24"/>
+          <w:szCs w:val="24"/>
+        </w:rPr>
+        <w:t xml:space="preserve">, </w:t>
+      </w:r>
+      <w:r>
+        <w:rPr>
+          <w:sz w:val="24"/>
+          <w:szCs w:val="24"/>
+        </w:rPr>
+        <w:t xml:space="preserve">while leaving large, smooth regions flat grey (zero motion estimation). </w:t>
+      </w:r>
+      <w:r>
+        <w:rPr>
+          <w:sz w:val="24"/>
+          <w:szCs w:val="24"/>
+        </w:rPr>
+        <w:t>When we look</w:t>
+      </w:r>
+      <w:r>
+        <w:rPr>
+          <w:sz w:val="24"/>
+          <w:szCs w:val="24"/>
+        </w:rPr>
+        <w:t xml:space="preserve"> at I2 warped to I1, the warped image suffers from severe distortion, tearing artifacts, and pixelated noise in the sky and mountain areas. This indicates that a single LK step at full resolution completely fails to reconstruct a clean transformation matrix between the two frames, leaving them visibly misaligned.</w:t>
+      </w:r>
+    </w:p>
+    <w:p>
+      <w:pPr>
+        <w:ind w:left="360"/>
+        <w:rPr>
+          <w:sz w:val="24"/>
+          <w:szCs w:val="24"/>
+          <w:lang w:val="en-US"/>
+        </w:rPr>
+      </w:pPr>
+      <w:r>
+        <w:rPr>
+          <w:sz w:val="24"/>
+          <w:szCs w:val="24"/>
+          <w:lang w:val="en-US"/>
+        </w:rPr>
+        <w:t xml:space="preserve">4.2. </w:t>
+      </w:r>
+      <w:r>
+        <w:rPr>
+          <w:sz w:val="24"/>
+          <w:szCs w:val="24"/>
+          <w:lang w:val="en-US"/>
+        </w:rPr>
+        <w:t>The one-step L</w:t>
+      </w:r>
+      <w:r>
+        <w:rPr>
+          <w:sz w:val="24"/>
+          <w:szCs w:val="24"/>
+          <w:lang w:val="en-US"/>
+        </w:rPr>
+        <w:t>K</w:t>
+      </w:r>
+      <w:r>
+        <w:rPr>
+          <w:sz w:val="24"/>
+          <w:szCs w:val="24"/>
+          <w:lang w:val="en-US"/>
+        </w:rPr>
+        <w:t xml:space="preserve"> result is highly imperfect because the physical movement between I1 and I2 violates the fundamental mathematical constraints </w:t>
+      </w:r>
+      <w:r>
+        <w:rPr>
+          <w:sz w:val="24"/>
+          <w:szCs w:val="24"/>
+          <w:lang w:val="en-US"/>
+        </w:rPr>
+        <w:t>the</w:t>
+      </w:r>
+      <w:r>
+        <w:rPr>
+          <w:sz w:val="24"/>
+          <w:szCs w:val="24"/>
+          <w:lang w:val="en-US"/>
+        </w:rPr>
+        <w:t xml:space="preserve"> optical flow estimation. </w:t>
+      </w:r>
+      <w:r>
+        <w:rPr>
+          <w:sz w:val="24"/>
+          <w:szCs w:val="24"/>
+          <w:lang w:val="en-US"/>
+        </w:rPr>
+        <w:t xml:space="preserve">As we have seen in lecture, </w:t>
+      </w:r>
+      <w:r>
+        <w:rPr>
+          <w:sz w:val="24"/>
+          <w:szCs w:val="24"/>
+          <w:lang w:val="en-US"/>
+        </w:rPr>
+        <w:t>L</w:t>
+      </w:r>
+      <w:r>
+        <w:rPr>
+          <w:sz w:val="24"/>
+          <w:szCs w:val="24"/>
+          <w:lang w:val="en-US"/>
+        </w:rPr>
+        <w:t>K</w:t>
+      </w:r>
+      <w:r>
+        <w:rPr>
+          <w:sz w:val="24"/>
+          <w:szCs w:val="24"/>
+          <w:lang w:val="en-US"/>
+        </w:rPr>
+        <w:t xml:space="preserve"> algorithm relies on a first-order Taylor series approximation, which is strictly valid only for tiny, sub-pixel </w:t>
+      </w:r>
+      <w:r>
+        <w:rPr>
+          <w:sz w:val="24"/>
+          <w:szCs w:val="24"/>
+          <w:lang w:val="en-US"/>
+        </w:rPr>
+        <w:lastRenderedPageBreak/>
+        <w:t xml:space="preserve">displacements. Because the actual motion in this video involves relatively large displacements (such as the rapid flow of the water and camera jitter), a single step operating on a small </w:t>
+      </w:r>
+      <m:oMath>
+        <m:r>
+          <w:rPr>
+            <w:rFonts w:ascii="Cambria Math" w:hAnsi="Cambria Math"/>
+            <w:sz w:val="24"/>
+            <w:szCs w:val="24"/>
+            <w:lang w:val="en-US"/>
+          </w:rPr>
+          <m:t>5</m:t>
+        </m:r>
+        <m:r>
+          <w:rPr>
+            <w:rFonts w:ascii="Cambria Math" w:hAnsi="Cambria Math"/>
+            <w:sz w:val="24"/>
+            <w:szCs w:val="24"/>
+            <w:lang w:val="en-US"/>
+          </w:rPr>
+          <m:t>×</m:t>
+        </m:r>
+        <m:r>
+          <w:rPr>
+            <w:rFonts w:ascii="Cambria Math" w:hAnsi="Cambria Math"/>
+            <w:sz w:val="24"/>
+            <w:szCs w:val="24"/>
+            <w:lang w:val="en-US"/>
+          </w:rPr>
+          <m:t xml:space="preserve"> 5</m:t>
+        </m:r>
+      </m:oMath>
+      <w:r>
+        <w:rPr>
+          <w:sz w:val="24"/>
+          <w:szCs w:val="24"/>
+          <w:lang w:val="en-US"/>
+        </w:rPr>
+        <w:t xml:space="preserve"> window can neither register the movement nor converge on the true velocity vectors. </w:t>
+      </w:r>
+      <w:r>
+        <w:rPr>
+          <w:sz w:val="24"/>
+          <w:szCs w:val="24"/>
+          <w:lang w:val="en-US"/>
+        </w:rPr>
+        <w:t>Moreover</w:t>
+      </w:r>
+      <w:r>
+        <w:rPr>
+          <w:sz w:val="24"/>
+          <w:szCs w:val="24"/>
+          <w:lang w:val="en-US"/>
+        </w:rPr>
+        <w:t xml:space="preserve">, smooth and uniform areas like the sky suffer heavily from the aperture problem and a lack of spatial gradients, meaning the local neighborhood does not provide enough distinct directional information to solve the over-determined system of equations reliably. </w:t>
+      </w:r>
+    </w:p>
+    <w:p>
+      <w:pPr>
+        <w:ind w:left="360"/>
+        <w:rPr>
+          <w:noProof/>
+        </w:rPr>
+      </w:pPr>
+      <w:r>
+        <w:rPr>
+          <w:sz w:val="24"/>
+          <w:szCs w:val="24"/>
+          <w:lang w:val="en-US"/>
+        </w:rPr>
+        <w:t>6. After running the full LK algorithm, we receive the following results:</w:t>
+      </w:r>
+      <w:r>
+        <w:rPr>
+          <w:sz w:val="24"/>
+          <w:szCs w:val="24"/>
+          <w:lang w:val="en-US"/>
+        </w:rPr>
+        <w:br/>
+      </w:r>
+      <w:r>
+        <w:rPr>
+          <w:noProof/>
+        </w:rPr>
+        <w:drawing>
+          <wp:inline distT="0" distB="0" distL="0" distR="0" wp14:anchorId="5846A90F" wp14:editId="0BDB3032">
+            <wp:extent cx="5731510" cy="5090160"/>
+            <wp:effectExtent l="0" t="0" r="2540" b="0"/>
+            <wp:docPr id="662274430" name="תמונה 4"/>
+            <wp:cNvGraphicFramePr>
+              <a:graphicFrameLocks xmlns:a="http://schemas.openxmlformats.org/drawingml/2006/main" noChangeAspect="1"/>
+            </wp:cNvGraphicFramePr>
+            <a:graphic xmlns:a="http://schemas.openxmlformats.org/drawingml/2006/main">
+              <a:graphicData uri="http://schemas.openxmlformats.org/drawingml/2006/picture">
+                <pic:pic xmlns:pic="http://schemas.openxmlformats.org/drawingml/2006/picture">
+                  <pic:nvPicPr>
+                    <pic:cNvPr id="0" name="Picture 10"/>
+                    <pic:cNvPicPr>
+                      <a:picLocks noChangeAspect="1" noChangeArrowheads="1"/>
+                    </pic:cNvPicPr>
+                  </pic:nvPicPr>
+                  <pic:blipFill rotWithShape="1">
+                    <a:blip r:embed="rId7">
+                      <a:extLst>
+                        <a:ext uri="{28A0092B-C50C-407E-A947-70E740481C1C}">
+                          <a14:useLocalDpi xmlns:a14="http://schemas.microsoft.com/office/drawing/2010/main" val="0"/>
+                        </a:ext>
+                      </a:extLst>
+                    </a:blip>
+                    <a:srcRect b="11190"/>
+                    <a:stretch>
+                      <a:fillRect/>
+                    </a:stretch>
+                  </pic:blipFill>
+                  <pic:spPr bwMode="auto">
+                    <a:xfrm>
+                      <a:off x="0" y="0"/>
+                      <a:ext cx="5731510" cy="5090160"/>
+                    </a:xfrm>
+                    <a:prstGeom prst="rect">
+                      <a:avLst/>
+                    </a:prstGeom>
+                    <a:noFill/>
+                    <a:ln>
+                      <a:noFill/>
+                    </a:ln>
+                    <a:extLst>
+                      <a:ext uri="{53640926-AAD7-44D8-BBD7-CCE9431645EC}">
+                        <a14:shadowObscured xmlns:a14="http://schemas.microsoft.com/office/drawing/2010/main"/>
+                      </a:ext>
+                    </a:extLst>
+                  </pic:spPr>
+                </pic:pic>
+              </a:graphicData>
+            </a:graphic>
+          </wp:inline>
+        </w:drawing>
+      </w:r>
+    </w:p>
+    <w:p>
+      <w:pPr>
+        <w:tabs>
+          <w:tab w:val="left" w:pos="1356"/>
+        </w:tabs>
+        <w:rPr>
+          <w:sz w:val="24"/>
+          <w:szCs w:val="24"/>
+          <w:lang w:val="en-US"/>
+        </w:rPr>
+      </w:pPr>
+      <w:r>
+        <w:rPr>
+          <w:sz w:val="24"/>
+          <w:szCs w:val="24"/>
+          <w:lang w:val="en-US"/>
+        </w:rPr>
+        <w:t>As we can see, the new results</w:t>
+      </w:r>
+      <w:r>
+        <w:rPr>
+          <w:sz w:val="24"/>
+          <w:szCs w:val="24"/>
+          <w:lang w:val="en-US"/>
+        </w:rPr>
+        <w:t xml:space="preserve"> demonstrate a significantly improved motion estimation compared to the single</w:t>
+      </w:r>
+      <w:r>
+        <w:rPr>
+          <w:sz w:val="24"/>
+          <w:szCs w:val="24"/>
+          <w:lang w:val="en-US"/>
+        </w:rPr>
+        <w:t xml:space="preserve"> </w:t>
+      </w:r>
+      <w:r>
+        <w:rPr>
+          <w:sz w:val="24"/>
+          <w:szCs w:val="24"/>
+          <w:lang w:val="en-US"/>
+        </w:rPr>
+        <w:t>step version. The velocity maps (</w:t>
+      </w:r>
+      <m:oMath>
+        <m:r>
+          <w:rPr>
+            <w:rFonts w:ascii="Cambria Math" w:hAnsi="Cambria Math"/>
+            <w:sz w:val="24"/>
+            <w:szCs w:val="24"/>
+            <w:lang w:val="en-US"/>
+          </w:rPr>
+          <m:t>du</m:t>
+        </m:r>
+      </m:oMath>
+      <w:r>
+        <w:rPr>
+          <w:sz w:val="24"/>
+          <w:szCs w:val="24"/>
+          <w:lang w:val="en-US"/>
+        </w:rPr>
+        <w:t xml:space="preserve"> and </w:t>
+      </w:r>
+      <m:oMath>
+        <m:r>
+          <w:rPr>
+            <w:rFonts w:ascii="Cambria Math" w:hAnsi="Cambria Math"/>
+            <w:sz w:val="24"/>
+            <w:szCs w:val="24"/>
+            <w:lang w:val="en-US"/>
+          </w:rPr>
+          <m:t>dv</m:t>
+        </m:r>
+      </m:oMath>
+      <w:r>
+        <w:rPr>
+          <w:sz w:val="24"/>
+          <w:szCs w:val="24"/>
+          <w:lang w:val="en-US"/>
+        </w:rPr>
+        <w:t xml:space="preserve">) are much smoother and </w:t>
+      </w:r>
+      <w:r>
+        <w:rPr>
+          <w:sz w:val="24"/>
+          <w:szCs w:val="24"/>
+          <w:lang w:val="en-US"/>
+        </w:rPr>
+        <w:t xml:space="preserve">describe in much </w:t>
+      </w:r>
+      <w:r>
+        <w:rPr>
+          <w:sz w:val="24"/>
+          <w:szCs w:val="24"/>
+          <w:lang w:val="en-US"/>
+        </w:rPr>
+        <w:t>clean</w:t>
+      </w:r>
+      <w:r>
+        <w:rPr>
+          <w:sz w:val="24"/>
+          <w:szCs w:val="24"/>
+          <w:lang w:val="en-US"/>
+        </w:rPr>
+        <w:t>er</w:t>
+      </w:r>
+      <w:r>
+        <w:rPr>
+          <w:sz w:val="24"/>
+          <w:szCs w:val="24"/>
+          <w:lang w:val="en-US"/>
+        </w:rPr>
+        <w:t xml:space="preserve"> </w:t>
+      </w:r>
+      <w:r>
+        <w:rPr>
+          <w:sz w:val="24"/>
+          <w:szCs w:val="24"/>
+          <w:lang w:val="en-US"/>
+        </w:rPr>
+        <w:t xml:space="preserve">and </w:t>
+      </w:r>
+      <w:r>
+        <w:rPr>
+          <w:sz w:val="24"/>
+          <w:szCs w:val="24"/>
+          <w:lang w:val="en-US"/>
+        </w:rPr>
+        <w:t xml:space="preserve">coherent </w:t>
+      </w:r>
+      <w:r>
+        <w:rPr>
+          <w:sz w:val="24"/>
+          <w:szCs w:val="24"/>
+          <w:lang w:val="en-US"/>
+        </w:rPr>
+        <w:t xml:space="preserve">way the </w:t>
+      </w:r>
+      <w:r>
+        <w:rPr>
+          <w:sz w:val="24"/>
+          <w:szCs w:val="24"/>
+          <w:lang w:val="en-US"/>
+        </w:rPr>
+        <w:t>global motion field across the mountain structures and water regions. Looking at I2 warped to I1, the severe distortion, tearing artifacts, and black</w:t>
+      </w:r>
+      <w:r>
+        <w:rPr>
+          <w:sz w:val="24"/>
+          <w:szCs w:val="24"/>
+          <w:lang w:val="en-US"/>
+        </w:rPr>
+        <w:t xml:space="preserve"> </w:t>
+      </w:r>
+      <w:r>
+        <w:rPr>
+          <w:sz w:val="24"/>
+          <w:szCs w:val="24"/>
+          <w:lang w:val="en-US"/>
+        </w:rPr>
+        <w:t>and</w:t>
+      </w:r>
+      <w:r>
+        <w:rPr>
+          <w:sz w:val="24"/>
+          <w:szCs w:val="24"/>
+          <w:lang w:val="en-US"/>
+        </w:rPr>
+        <w:t xml:space="preserve"> </w:t>
+      </w:r>
+      <w:r>
+        <w:rPr>
+          <w:sz w:val="24"/>
+          <w:szCs w:val="24"/>
+          <w:lang w:val="en-US"/>
+        </w:rPr>
+        <w:t xml:space="preserve">white noisy spots that plagued the sky and </w:t>
+      </w:r>
+      <w:r>
+        <w:rPr>
+          <w:sz w:val="24"/>
+          <w:szCs w:val="24"/>
+          <w:lang w:val="en-US"/>
+        </w:rPr>
+        <w:lastRenderedPageBreak/>
+        <w:t>textured borders in the one</w:t>
+      </w:r>
+      <w:r>
+        <w:rPr>
+          <w:sz w:val="24"/>
+          <w:szCs w:val="24"/>
+          <w:lang w:val="en-US"/>
+        </w:rPr>
+        <w:t xml:space="preserve"> </w:t>
+      </w:r>
+      <w:r>
+        <w:rPr>
+          <w:sz w:val="24"/>
+          <w:szCs w:val="24"/>
+          <w:lang w:val="en-US"/>
+        </w:rPr>
+        <w:t xml:space="preserve">step process are completely resolved. The warped frame </w:t>
+      </w:r>
+      <m:oMath>
+        <m:sSub>
+          <m:sSubPr>
+            <m:ctrlPr>
+              <w:rPr>
+                <w:rFonts w:ascii="Cambria Math" w:hAnsi="Cambria Math"/>
+                <w:i/>
+                <w:sz w:val="24"/>
+                <w:szCs w:val="24"/>
+                <w:lang w:val="en-US"/>
+              </w:rPr>
+            </m:ctrlPr>
+          </m:sSubPr>
+          <m:e>
+            <m:r>
+              <w:rPr>
+                <w:rFonts w:ascii="Cambria Math" w:hAnsi="Cambria Math"/>
+                <w:sz w:val="24"/>
+                <w:szCs w:val="24"/>
+                <w:lang w:val="en-US"/>
+              </w:rPr>
+              <m:t>I</m:t>
+            </m:r>
+          </m:e>
+          <m:sub>
+            <m:r>
+              <w:rPr>
+                <w:rFonts w:ascii="Cambria Math" w:hAnsi="Cambria Math"/>
+                <w:sz w:val="24"/>
+                <w:szCs w:val="24"/>
+                <w:lang w:val="en-US"/>
+              </w:rPr>
+              <m:t>2</m:t>
+            </m:r>
+          </m:sub>
+        </m:sSub>
+      </m:oMath>
+      <w:r>
+        <w:rPr>
+          <w:sz w:val="24"/>
+          <w:szCs w:val="24"/>
+          <w:lang w:val="en-US"/>
+        </w:rPr>
+        <w:t xml:space="preserve"> matches the target frame </w:t>
+      </w:r>
+      <m:oMath>
+        <m:sSub>
+          <m:sSubPr>
+            <m:ctrlPr>
+              <w:rPr>
+                <w:rFonts w:ascii="Cambria Math" w:hAnsi="Cambria Math"/>
+                <w:i/>
+                <w:sz w:val="24"/>
+                <w:szCs w:val="24"/>
+                <w:lang w:val="en-US"/>
+              </w:rPr>
+            </m:ctrlPr>
+          </m:sSubPr>
+          <m:e>
+            <m:r>
+              <w:rPr>
+                <w:rFonts w:ascii="Cambria Math" w:hAnsi="Cambria Math"/>
+                <w:sz w:val="24"/>
+                <w:szCs w:val="24"/>
+                <w:lang w:val="en-US"/>
+              </w:rPr>
+              <m:t>I</m:t>
+            </m:r>
+          </m:e>
+          <m:sub>
+            <m:r>
+              <w:rPr>
+                <w:rFonts w:ascii="Cambria Math" w:hAnsi="Cambria Math"/>
+                <w:sz w:val="24"/>
+                <w:szCs w:val="24"/>
+                <w:lang w:val="en-US"/>
+              </w:rPr>
+              <m:t>1</m:t>
+            </m:r>
+          </m:sub>
+        </m:sSub>
+      </m:oMath>
+      <w:r>
+        <w:rPr>
+          <w:sz w:val="24"/>
+          <w:szCs w:val="24"/>
+          <w:lang w:val="en-US"/>
+        </w:rPr>
+        <w:t xml:space="preserve"> almost perfectly, validating that </w:t>
+      </w:r>
+      <w:r>
+        <w:rPr>
+          <w:sz w:val="24"/>
+          <w:szCs w:val="24"/>
+          <w:lang w:val="en-US"/>
+        </w:rPr>
+        <w:t>multi-step</w:t>
+      </w:r>
+      <w:r>
+        <w:rPr>
+          <w:sz w:val="24"/>
+          <w:szCs w:val="24"/>
+          <w:lang w:val="en-US"/>
+        </w:rPr>
+        <w:t xml:space="preserve"> iterative updates accurately alignment the image structures. </w:t>
+      </w:r>
+    </w:p>
+    <w:p>
+      <w:pPr>
+        <w:tabs>
+          <w:tab w:val="left" w:pos="1356"/>
+        </w:tabs>
+        <w:rPr>
+          <w:sz w:val="24"/>
+          <w:szCs w:val="24"/>
+          <w:lang w:val="en-US"/>
+        </w:rPr>
+      </w:pPr>
+      <w:r>
+        <w:rPr>
+          <w:sz w:val="24"/>
+          <w:szCs w:val="24"/>
+          <w:lang w:val="en-US"/>
+        </w:rPr>
+        <w:t xml:space="preserve">The </w:t>
+      </w:r>
+      <w:r>
+        <w:rPr>
+          <w:sz w:val="24"/>
+          <w:szCs w:val="24"/>
+          <w:lang w:val="en-US"/>
+        </w:rPr>
+        <w:t xml:space="preserve">new </w:t>
+      </w:r>
+      <w:r>
+        <w:rPr>
+          <w:sz w:val="24"/>
+          <w:szCs w:val="24"/>
+          <w:lang w:val="en-US"/>
+        </w:rPr>
+        <w:t>gif</w:t>
+      </w:r>
+      <w:r>
+        <w:rPr>
+          <w:sz w:val="24"/>
+          <w:szCs w:val="24"/>
+          <w:lang w:val="en-US"/>
+        </w:rPr>
+        <w:t xml:space="preserve"> output</w:t>
+      </w:r>
+      <w:r>
+        <w:rPr>
+          <w:sz w:val="24"/>
+          <w:szCs w:val="24"/>
+          <w:lang w:val="en-US"/>
+        </w:rPr>
+        <w:t xml:space="preserve"> looks </w:t>
+      </w:r>
+      <w:r>
+        <w:rPr>
+          <w:sz w:val="24"/>
+          <w:szCs w:val="24"/>
+          <w:lang w:val="en-US"/>
+        </w:rPr>
+        <w:t>much</w:t>
+      </w:r>
+      <w:r>
+        <w:rPr>
+          <w:sz w:val="24"/>
+          <w:szCs w:val="24"/>
+          <w:lang w:val="en-US"/>
+        </w:rPr>
+        <w:t xml:space="preserve"> better than the single-step version because the multi-resolution image pyramid overcomes the displacement limitations of the L</w:t>
+      </w:r>
+      <w:r>
+        <w:rPr>
+          <w:sz w:val="24"/>
+          <w:szCs w:val="24"/>
+          <w:lang w:val="en-US"/>
+        </w:rPr>
+        <w:t>K</w:t>
+      </w:r>
+      <w:r>
+        <w:rPr>
+          <w:sz w:val="24"/>
+          <w:szCs w:val="24"/>
+          <w:lang w:val="en-US"/>
+        </w:rPr>
+        <w:t xml:space="preserve"> algorithm. By downsampling the images to higher pyramid levels, large physical frame-to-frame movements are reduced to tiny, sub-pixel shifts at the </w:t>
+      </w:r>
+      <w:r>
+        <w:rPr>
+          <w:sz w:val="24"/>
+          <w:szCs w:val="24"/>
+          <w:lang w:val="en-US"/>
+        </w:rPr>
+        <w:t>reduced</w:t>
+      </w:r>
+      <w:r>
+        <w:rPr>
+          <w:sz w:val="24"/>
+          <w:szCs w:val="24"/>
+          <w:lang w:val="en-US"/>
+        </w:rPr>
+        <w:t xml:space="preserve"> scale, satisfying the mathematical validity of the first-order Taylor series approximation. The algorithm can then reliably solve for these large motion vectors at a small resolution and propagate them down as starting estimates for </w:t>
+      </w:r>
+      <w:r>
+        <w:rPr>
+          <w:sz w:val="24"/>
+          <w:szCs w:val="24"/>
+          <w:lang w:val="en-US"/>
+        </w:rPr>
+        <w:t>lower</w:t>
+      </w:r>
+      <w:r>
+        <w:rPr>
+          <w:sz w:val="24"/>
+          <w:szCs w:val="24"/>
+          <w:lang w:val="en-US"/>
+        </w:rPr>
+        <w:t xml:space="preserve"> levels. This iterative warping enables the system to track both large-scale camera translations and fine, high-frequency textural motions without breaking down or producing interpolation artifacts. </w:t>
+      </w:r>
+    </w:p>
+    <w:p>
+      <w:pPr>
+        <w:tabs>
+          <w:tab w:val="left" w:pos="1356"/>
+        </w:tabs>
+        <w:rPr>
+          <w:sz w:val="24"/>
+          <w:szCs w:val="24"/>
+          <w:lang w:val="en-US"/>
+        </w:rPr>
+      </w:pPr>
     </w:p>
     <w:sectPr>
       <w:pgSz w:w="11906" w:h="16838"/>

</xml_diff>